<commit_message>
Add: add logic to display username and profile pic
</commit_message>
<xml_diff>
--- a/flow.docx
+++ b/flow.docx
@@ -685,6 +685,34 @@
       <w:proofErr w:type="spellEnd"/>
       <w:r>
         <w:t xml:space="preserve"> in feed component</w:t>
+      </w:r>
+    </w:p>
+    <w:p>
+      <w:pPr>
+        <w:pStyle w:val="ListParagraph"/>
+        <w:numPr>
+          <w:ilvl w:val="0"/>
+          <w:numId w:val="1"/>
+        </w:numPr>
+      </w:pPr>
+      <w:r>
+        <w:t xml:space="preserve">make </w:t>
+      </w:r>
+      <w:proofErr w:type="spellStart"/>
+      <w:r>
+        <w:t>PostCard</w:t>
+      </w:r>
+      <w:proofErr w:type="spellEnd"/>
+      <w:r>
+        <w:t xml:space="preserve"> dynamic by removing static data and adding original </w:t>
+      </w:r>
+      <w:proofErr w:type="spellStart"/>
+      <w:r>
+        <w:t>db</w:t>
+      </w:r>
+      <w:proofErr w:type="spellEnd"/>
+      <w:r>
+        <w:t xml:space="preserve"> data</w:t>
       </w:r>
       <w:bookmarkStart w:id="0" w:name="_GoBack"/>
       <w:bookmarkEnd w:id="0"/>

</xml_diff>

<commit_message>
Add: add like/dislike system in the app
</commit_message>
<xml_diff>
--- a/flow.docx
+++ b/flow.docx
@@ -384,13 +384,43 @@
         </w:numPr>
       </w:pPr>
       <w:proofErr w:type="spellStart"/>
+      <w:proofErr w:type="gramStart"/>
       <w:r>
         <w:t>createPost</w:t>
       </w:r>
       <w:proofErr w:type="spellEnd"/>
       <w:r>
-        <w:t>() in postControllers.js</w:t>
-      </w:r>
+        <w:t>(</w:t>
+      </w:r>
+      <w:proofErr w:type="gramEnd"/>
+      <w:r>
+        <w:t>) in postControllers.js</w:t>
+      </w:r>
+    </w:p>
+    <w:p>
+      <w:pPr>
+        <w:pStyle w:val="ListParagraph"/>
+        <w:numPr>
+          <w:ilvl w:val="0"/>
+          <w:numId w:val="1"/>
+        </w:numPr>
+      </w:pPr>
+      <w:r>
+        <w:t xml:space="preserve">enrichPost.js in </w:t>
+      </w:r>
+      <w:proofErr w:type="spellStart"/>
+      <w:r>
+        <w:t>api</w:t>
+      </w:r>
+      <w:proofErr w:type="spellEnd"/>
+      <w:r>
+        <w:t>/</w:t>
+      </w:r>
+      <w:proofErr w:type="spellStart"/>
+      <w:r>
+        <w:t>utils</w:t>
+      </w:r>
+      <w:proofErr w:type="spellEnd"/>
     </w:p>
     <w:p>
       <w:pPr>
@@ -426,6 +456,26 @@
       </w:pPr>
       <w:proofErr w:type="spellStart"/>
       <w:r>
+        <w:t>f</w:t>
+      </w:r>
+      <w:r>
+        <w:t>eed.jsx</w:t>
+      </w:r>
+      <w:proofErr w:type="spellEnd"/>
+      <w:r>
+        <w:t xml:space="preserve"> component</w:t>
+      </w:r>
+    </w:p>
+    <w:p>
+      <w:pPr>
+        <w:pStyle w:val="ListParagraph"/>
+        <w:numPr>
+          <w:ilvl w:val="0"/>
+          <w:numId w:val="1"/>
+        </w:numPr>
+      </w:pPr>
+      <w:proofErr w:type="spellStart"/>
+      <w:r>
         <w:t>createPost</w:t>
       </w:r>
       <w:proofErr w:type="spellEnd"/>
@@ -504,20 +554,6 @@
       </w:pPr>
       <w:proofErr w:type="spellStart"/>
       <w:r>
-        <w:t>feed.jsx</w:t>
-      </w:r>
-      <w:proofErr w:type="spellEnd"/>
-    </w:p>
-    <w:p>
-      <w:pPr>
-        <w:pStyle w:val="ListParagraph"/>
-        <w:numPr>
-          <w:ilvl w:val="0"/>
-          <w:numId w:val="1"/>
-        </w:numPr>
-      </w:pPr>
-      <w:proofErr w:type="spellStart"/>
-      <w:r>
         <w:t>rightbar.jsx</w:t>
       </w:r>
       <w:proofErr w:type="spellEnd"/>
@@ -714,6 +750,96 @@
       <w:r>
         <w:t xml:space="preserve"> data</w:t>
       </w:r>
+    </w:p>
+    <w:p>
+      <w:pPr>
+        <w:pStyle w:val="ListParagraph"/>
+        <w:numPr>
+          <w:ilvl w:val="0"/>
+          <w:numId w:val="1"/>
+        </w:numPr>
+      </w:pPr>
+      <w:r>
+        <w:t xml:space="preserve">add </w:t>
+      </w:r>
+      <w:proofErr w:type="spellStart"/>
+      <w:proofErr w:type="gramStart"/>
+      <w:r>
+        <w:t>likePost</w:t>
+      </w:r>
+      <w:proofErr w:type="spellEnd"/>
+      <w:r>
+        <w:t>(</w:t>
+      </w:r>
+      <w:proofErr w:type="gramEnd"/>
+      <w:r>
+        <w:t xml:space="preserve">) in </w:t>
+      </w:r>
+      <w:proofErr w:type="spellStart"/>
+      <w:r>
+        <w:t>postController</w:t>
+      </w:r>
+      <w:proofErr w:type="spellEnd"/>
+    </w:p>
+    <w:p>
+      <w:pPr>
+        <w:pStyle w:val="ListParagraph"/>
+        <w:numPr>
+          <w:ilvl w:val="0"/>
+          <w:numId w:val="1"/>
+        </w:numPr>
+      </w:pPr>
+      <w:r>
+        <w:lastRenderedPageBreak/>
+        <w:t xml:space="preserve">add </w:t>
+      </w:r>
+      <w:proofErr w:type="spellStart"/>
+      <w:r>
+        <w:t>likePost</w:t>
+      </w:r>
+      <w:proofErr w:type="spellEnd"/>
+      <w:r>
+        <w:t xml:space="preserve"> route in </w:t>
+      </w:r>
+      <w:proofErr w:type="spellStart"/>
+      <w:r>
+        <w:t>postRoutes</w:t>
+      </w:r>
+      <w:proofErr w:type="spellEnd"/>
+    </w:p>
+    <w:p>
+      <w:pPr>
+        <w:pStyle w:val="ListParagraph"/>
+        <w:numPr>
+          <w:ilvl w:val="0"/>
+          <w:numId w:val="1"/>
+        </w:numPr>
+      </w:pPr>
+      <w:r>
+        <w:t xml:space="preserve">add </w:t>
+      </w:r>
+      <w:proofErr w:type="spellStart"/>
+      <w:r>
+        <w:t>likePost</w:t>
+      </w:r>
+      <w:proofErr w:type="spellEnd"/>
+      <w:r>
+        <w:t xml:space="preserve"> click handler in </w:t>
+      </w:r>
+      <w:proofErr w:type="spellStart"/>
+      <w:r>
+        <w:t>PostCard</w:t>
+      </w:r>
+      <w:proofErr w:type="spellEnd"/>
+    </w:p>
+    <w:p>
+      <w:pPr>
+        <w:pStyle w:val="ListParagraph"/>
+        <w:numPr>
+          <w:ilvl w:val="0"/>
+          <w:numId w:val="1"/>
+        </w:numPr>
+      </w:pPr>
       <w:bookmarkStart w:id="0" w:name="_GoBack"/>
       <w:bookmarkEnd w:id="0"/>
     </w:p>

</xml_diff>

<commit_message>
Add: add edit post system
</commit_message>
<xml_diff>
--- a/flow.docx
+++ b/flow.docx
@@ -1,6 +1,6 @@
 
 <file path=word/document.xml><?xml version="1.0" encoding="utf-8"?>
-<w:document xmlns:wpc="http://schemas.microsoft.com/office/word/2010/wordprocessingCanvas" xmlns:cx="http://schemas.microsoft.com/office/drawing/2014/chartex" xmlns:mc="http://schemas.openxmlformats.org/markup-compatibility/2006" xmlns:o="urn:schemas-microsoft-com:office:office" xmlns:r="http://schemas.openxmlformats.org/officeDocument/2006/relationships" xmlns:m="http://schemas.openxmlformats.org/officeDocument/2006/math" xmlns:v="urn:schemas-microsoft-com:vml" xmlns:wp14="http://schemas.microsoft.com/office/word/2010/wordprocessingDrawing" xmlns:wp="http://schemas.openxmlformats.org/drawingml/2006/wordprocessingDrawing" xmlns:w10="urn:schemas-microsoft-com:office:word" xmlns:w="http://schemas.openxmlformats.org/wordprocessingml/2006/main" xmlns:w14="http://schemas.microsoft.com/office/word/2010/wordml" xmlns:w15="http://schemas.microsoft.com/office/word/2012/wordml" xmlns:w16se="http://schemas.microsoft.com/office/word/2015/wordml/symex" xmlns:wpg="http://schemas.microsoft.com/office/word/2010/wordprocessingGroup" xmlns:wpi="http://schemas.microsoft.com/office/word/2010/wordprocessingInk" xmlns:wne="http://schemas.microsoft.com/office/word/2006/wordml" xmlns:wps="http://schemas.microsoft.com/office/word/2010/wordprocessingShape" mc:Ignorable="w14 w15 w16se wp14">
+<w:document xmlns:wpc="http://schemas.microsoft.com/office/word/2010/wordprocessingCanvas" xmlns:cx="http://schemas.microsoft.com/office/drawing/2014/chartex" xmlns:cx1="http://schemas.microsoft.com/office/drawing/2015/9/8/chartex" xmlns:mc="http://schemas.openxmlformats.org/markup-compatibility/2006" xmlns:o="urn:schemas-microsoft-com:office:office" xmlns:r="http://schemas.openxmlformats.org/officeDocument/2006/relationships" xmlns:m="http://schemas.openxmlformats.org/officeDocument/2006/math" xmlns:v="urn:schemas-microsoft-com:vml" xmlns:wp14="http://schemas.microsoft.com/office/word/2010/wordprocessingDrawing" xmlns:wp="http://schemas.openxmlformats.org/drawingml/2006/wordprocessingDrawing" xmlns:w10="urn:schemas-microsoft-com:office:word" xmlns:w="http://schemas.openxmlformats.org/wordprocessingml/2006/main" xmlns:w14="http://schemas.microsoft.com/office/word/2010/wordml" xmlns:w15="http://schemas.microsoft.com/office/word/2012/wordml" xmlns:w16se="http://schemas.microsoft.com/office/word/2015/wordml/symex" xmlns:wpg="http://schemas.microsoft.com/office/word/2010/wordprocessingGroup" xmlns:wpi="http://schemas.microsoft.com/office/word/2010/wordprocessingInk" xmlns:wne="http://schemas.microsoft.com/office/word/2006/wordml" xmlns:wps="http://schemas.microsoft.com/office/word/2010/wordprocessingShape" mc:Ignorable="w14 w15 w16se wp14">
   <w:body>
     <w:p>
       <w:pPr>
@@ -384,17 +384,12 @@
         </w:numPr>
       </w:pPr>
       <w:proofErr w:type="spellStart"/>
-      <w:proofErr w:type="gramStart"/>
       <w:r>
         <w:t>createPost</w:t>
       </w:r>
       <w:proofErr w:type="spellEnd"/>
       <w:r>
-        <w:t>(</w:t>
-      </w:r>
-      <w:proofErr w:type="gramEnd"/>
-      <w:r>
-        <w:t>) in postControllers.js</w:t>
+        <w:t>() in postControllers.js</w:t>
       </w:r>
     </w:p>
     <w:p>
@@ -456,10 +451,7 @@
       </w:pPr>
       <w:proofErr w:type="spellStart"/>
       <w:r>
-        <w:t>f</w:t>
-      </w:r>
-      <w:r>
-        <w:t>eed.jsx</w:t>
+        <w:t>feed.jsx</w:t>
       </w:r>
       <w:proofErr w:type="spellEnd"/>
       <w:r>
@@ -495,39 +487,29 @@
         <w:t xml:space="preserve">create </w:t>
       </w:r>
       <w:proofErr w:type="spellStart"/>
-      <w:proofErr w:type="gramStart"/>
       <w:r>
         <w:t>PostCard</w:t>
       </w:r>
       <w:proofErr w:type="spellEnd"/>
       <w:r>
-        <w:t>(</w:t>
-      </w:r>
-      <w:proofErr w:type="gramEnd"/>
-      <w:r>
-        <w:t>) component</w:t>
-      </w:r>
-    </w:p>
-    <w:p>
-      <w:pPr>
-        <w:pStyle w:val="ListParagraph"/>
-        <w:numPr>
-          <w:ilvl w:val="0"/>
-          <w:numId w:val="1"/>
-        </w:numPr>
-      </w:pPr>
-      <w:proofErr w:type="spellStart"/>
-      <w:proofErr w:type="gramStart"/>
+        <w:t>() component</w:t>
+      </w:r>
+    </w:p>
+    <w:p>
+      <w:pPr>
+        <w:pStyle w:val="ListParagraph"/>
+        <w:numPr>
+          <w:ilvl w:val="0"/>
+          <w:numId w:val="1"/>
+        </w:numPr>
+      </w:pPr>
+      <w:proofErr w:type="spellStart"/>
       <w:r>
         <w:t>createPostCall</w:t>
       </w:r>
       <w:proofErr w:type="spellEnd"/>
       <w:r>
-        <w:t>(</w:t>
-      </w:r>
-      <w:proofErr w:type="gramEnd"/>
-      <w:r>
-        <w:t>) in apiCalls.js</w:t>
+        <w:t>() in apiCalls.js</w:t>
       </w:r>
     </w:p>
     <w:p>
@@ -567,17 +549,12 @@
         </w:numPr>
       </w:pPr>
       <w:proofErr w:type="spellStart"/>
-      <w:proofErr w:type="gramStart"/>
       <w:r>
         <w:t>getAllPosts</w:t>
       </w:r>
       <w:proofErr w:type="spellEnd"/>
       <w:r>
-        <w:t>(</w:t>
-      </w:r>
-      <w:proofErr w:type="gramEnd"/>
-      <w:r>
-        <w:t>) in postController.js</w:t>
+        <w:t>() in postController.js</w:t>
       </w:r>
     </w:p>
     <w:p>
@@ -606,17 +583,12 @@
         </w:numPr>
       </w:pPr>
       <w:proofErr w:type="spellStart"/>
-      <w:proofErr w:type="gramStart"/>
       <w:r>
         <w:t>getAllPostsCall</w:t>
       </w:r>
       <w:proofErr w:type="spellEnd"/>
       <w:r>
-        <w:t>(</w:t>
-      </w:r>
-      <w:proofErr w:type="gramEnd"/>
-      <w:r>
-        <w:t>) in apiCalls.js</w:t>
+        <w:t>() in apiCalls.js</w:t>
       </w:r>
     </w:p>
     <w:p>
@@ -763,17 +735,12 @@
         <w:t xml:space="preserve">add </w:t>
       </w:r>
       <w:proofErr w:type="spellStart"/>
-      <w:proofErr w:type="gramStart"/>
       <w:r>
         <w:t>likePost</w:t>
       </w:r>
       <w:proofErr w:type="spellEnd"/>
       <w:r>
-        <w:t>(</w:t>
-      </w:r>
-      <w:proofErr w:type="gramEnd"/>
-      <w:r>
-        <w:t xml:space="preserve">) in </w:t>
+        <w:t xml:space="preserve">() in </w:t>
       </w:r>
       <w:proofErr w:type="spellStart"/>
       <w:r>
@@ -790,7 +757,6 @@
         </w:numPr>
       </w:pPr>
       <w:r>
-        <w:lastRenderedPageBreak/>
         <w:t xml:space="preserve">add </w:t>
       </w:r>
       <w:proofErr w:type="spellStart"/>
@@ -844,17 +810,12 @@
         <w:t xml:space="preserve">add </w:t>
       </w:r>
       <w:proofErr w:type="spellStart"/>
-      <w:proofErr w:type="gramStart"/>
       <w:r>
         <w:t>likePostCall</w:t>
       </w:r>
       <w:proofErr w:type="spellEnd"/>
       <w:r>
-        <w:t>(</w:t>
-      </w:r>
-      <w:proofErr w:type="gramEnd"/>
-      <w:r>
-        <w:t>) in apiCalls.js</w:t>
+        <w:t>() in apiCalls.js</w:t>
       </w:r>
     </w:p>
     <w:p>
@@ -869,17 +830,12 @@
         <w:t xml:space="preserve">add </w:t>
       </w:r>
       <w:proofErr w:type="spellStart"/>
-      <w:proofErr w:type="gramStart"/>
       <w:r>
         <w:t>deletePost</w:t>
       </w:r>
       <w:proofErr w:type="spellEnd"/>
       <w:r>
-        <w:t>(</w:t>
-      </w:r>
-      <w:proofErr w:type="gramEnd"/>
-      <w:r>
-        <w:t>) in post controller</w:t>
+        <w:t>() in post controller</w:t>
       </w:r>
     </w:p>
     <w:p>
@@ -937,9 +893,89 @@
       <w:proofErr w:type="spellEnd"/>
       <w:r>
         <w:t>() in apiCalls.js</w:t>
+      </w:r>
+    </w:p>
+    <w:p>
+      <w:pPr>
+        <w:pStyle w:val="ListParagraph"/>
+        <w:numPr>
+          <w:ilvl w:val="0"/>
+          <w:numId w:val="1"/>
+        </w:numPr>
+      </w:pPr>
+      <w:r>
+        <w:t xml:space="preserve">add edit button and </w:t>
+      </w:r>
+      <w:proofErr w:type="spellStart"/>
+      <w:r>
+        <w:t>handleEdit</w:t>
+      </w:r>
+      <w:proofErr w:type="spellEnd"/>
+      <w:r>
+        <w:t xml:space="preserve"> function in </w:t>
+      </w:r>
+      <w:proofErr w:type="spellStart"/>
+      <w:r>
+        <w:t>postcard.jsx</w:t>
+      </w:r>
+      <w:proofErr w:type="spellEnd"/>
+    </w:p>
+    <w:p>
+      <w:pPr>
+        <w:pStyle w:val="ListParagraph"/>
+        <w:numPr>
+          <w:ilvl w:val="0"/>
+          <w:numId w:val="1"/>
+        </w:numPr>
+      </w:pPr>
+      <w:r>
+        <w:t xml:space="preserve">add </w:t>
+      </w:r>
+      <w:proofErr w:type="spellStart"/>
+      <w:r>
+        <w:t>handleEditCall</w:t>
+      </w:r>
+      <w:proofErr w:type="spellEnd"/>
+      <w:r>
+        <w:t>() in apiCalls.js</w:t>
+      </w:r>
+    </w:p>
+    <w:p>
+      <w:pPr>
+        <w:pStyle w:val="ListParagraph"/>
+        <w:numPr>
+          <w:ilvl w:val="0"/>
+          <w:numId w:val="1"/>
+        </w:numPr>
+      </w:pPr>
+      <w:r>
+        <w:t>add edit route in post routes</w:t>
+      </w:r>
+    </w:p>
+    <w:p>
+      <w:pPr>
+        <w:pStyle w:val="ListParagraph"/>
+        <w:numPr>
+          <w:ilvl w:val="0"/>
+          <w:numId w:val="1"/>
+        </w:numPr>
+      </w:pPr>
+      <w:r>
+        <w:t xml:space="preserve">add </w:t>
+      </w:r>
+      <w:proofErr w:type="spellStart"/>
+      <w:r>
+        <w:t>editPost</w:t>
+      </w:r>
+      <w:proofErr w:type="spellEnd"/>
+      <w:r>
+        <w:t>() in post controller.js</w:t>
       </w:r>
       <w:bookmarkStart w:id="0" w:name="_GoBack"/>
       <w:bookmarkEnd w:id="0"/>
+      <w:r>
+        <w:t xml:space="preserve"> </w:t>
+      </w:r>
     </w:p>
     <w:sectPr>
       <w:pgSz w:w="12240" w:h="15840"/>
@@ -952,7 +988,7 @@
 </file>
 
 <file path=word/numbering.xml><?xml version="1.0" encoding="utf-8"?>
-<w:numbering xmlns:wpc="http://schemas.microsoft.com/office/word/2010/wordprocessingCanvas" xmlns:cx="http://schemas.microsoft.com/office/drawing/2014/chartex" xmlns:mc="http://schemas.openxmlformats.org/markup-compatibility/2006" xmlns:o="urn:schemas-microsoft-com:office:office" xmlns:r="http://schemas.openxmlformats.org/officeDocument/2006/relationships" xmlns:m="http://schemas.openxmlformats.org/officeDocument/2006/math" xmlns:v="urn:schemas-microsoft-com:vml" xmlns:wp14="http://schemas.microsoft.com/office/word/2010/wordprocessingDrawing" xmlns:wp="http://schemas.openxmlformats.org/drawingml/2006/wordprocessingDrawing" xmlns:w10="urn:schemas-microsoft-com:office:word" xmlns:w="http://schemas.openxmlformats.org/wordprocessingml/2006/main" xmlns:w14="http://schemas.microsoft.com/office/word/2010/wordml" xmlns:w15="http://schemas.microsoft.com/office/word/2012/wordml" xmlns:w16se="http://schemas.microsoft.com/office/word/2015/wordml/symex" xmlns:wpg="http://schemas.microsoft.com/office/word/2010/wordprocessingGroup" xmlns:wpi="http://schemas.microsoft.com/office/word/2010/wordprocessingInk" xmlns:wne="http://schemas.microsoft.com/office/word/2006/wordml" xmlns:wps="http://schemas.microsoft.com/office/word/2010/wordprocessingShape" mc:Ignorable="w14 w15 w16se wp14">
+<w:numbering xmlns:wpc="http://schemas.microsoft.com/office/word/2010/wordprocessingCanvas" xmlns:cx="http://schemas.microsoft.com/office/drawing/2014/chartex" xmlns:cx1="http://schemas.microsoft.com/office/drawing/2015/9/8/chartex" xmlns:mc="http://schemas.openxmlformats.org/markup-compatibility/2006" xmlns:o="urn:schemas-microsoft-com:office:office" xmlns:r="http://schemas.openxmlformats.org/officeDocument/2006/relationships" xmlns:m="http://schemas.openxmlformats.org/officeDocument/2006/math" xmlns:v="urn:schemas-microsoft-com:vml" xmlns:wp14="http://schemas.microsoft.com/office/word/2010/wordprocessingDrawing" xmlns:wp="http://schemas.openxmlformats.org/drawingml/2006/wordprocessingDrawing" xmlns:w10="urn:schemas-microsoft-com:office:word" xmlns:w="http://schemas.openxmlformats.org/wordprocessingml/2006/main" xmlns:w14="http://schemas.microsoft.com/office/word/2010/wordml" xmlns:w15="http://schemas.microsoft.com/office/word/2012/wordml" xmlns:w16se="http://schemas.microsoft.com/office/word/2015/wordml/symex" xmlns:wpg="http://schemas.microsoft.com/office/word/2010/wordprocessingGroup" xmlns:wpi="http://schemas.microsoft.com/office/word/2010/wordprocessingInk" xmlns:wne="http://schemas.microsoft.com/office/word/2006/wordml" xmlns:wps="http://schemas.microsoft.com/office/word/2010/wordprocessingShape" mc:Ignorable="w14 w15 w16se wp14">
   <w:abstractNum w:abstractNumId="0" w15:restartNumberingAfterBreak="0">
     <w:nsid w:val="658B4609"/>
     <w:multiLevelType w:val="hybridMultilevel"/>

</xml_diff>

<commit_message>
Add: add flow of profile system
</commit_message>
<xml_diff>
--- a/flow.docx
+++ b/flow.docx
@@ -1,6 +1,6 @@
 
 <file path=word/document.xml><?xml version="1.0" encoding="utf-8"?>
-<w:document xmlns:wpc="http://schemas.microsoft.com/office/word/2010/wordprocessingCanvas" xmlns:cx="http://schemas.microsoft.com/office/drawing/2014/chartex" xmlns:cx1="http://schemas.microsoft.com/office/drawing/2015/9/8/chartex" xmlns:mc="http://schemas.openxmlformats.org/markup-compatibility/2006" xmlns:o="urn:schemas-microsoft-com:office:office" xmlns:r="http://schemas.openxmlformats.org/officeDocument/2006/relationships" xmlns:m="http://schemas.openxmlformats.org/officeDocument/2006/math" xmlns:v="urn:schemas-microsoft-com:vml" xmlns:wp14="http://schemas.microsoft.com/office/word/2010/wordprocessingDrawing" xmlns:wp="http://schemas.openxmlformats.org/drawingml/2006/wordprocessingDrawing" xmlns:w10="urn:schemas-microsoft-com:office:word" xmlns:w="http://schemas.openxmlformats.org/wordprocessingml/2006/main" xmlns:w14="http://schemas.microsoft.com/office/word/2010/wordml" xmlns:w15="http://schemas.microsoft.com/office/word/2012/wordml" xmlns:w16se="http://schemas.microsoft.com/office/word/2015/wordml/symex" xmlns:wpg="http://schemas.microsoft.com/office/word/2010/wordprocessingGroup" xmlns:wpi="http://schemas.microsoft.com/office/word/2010/wordprocessingInk" xmlns:wne="http://schemas.microsoft.com/office/word/2006/wordml" xmlns:wps="http://schemas.microsoft.com/office/word/2010/wordprocessingShape" mc:Ignorable="w14 w15 w16se wp14">
+<w:document xmlns:wpc="http://schemas.microsoft.com/office/word/2010/wordprocessingCanvas" xmlns:cx="http://schemas.microsoft.com/office/drawing/2014/chartex" xmlns:mc="http://schemas.openxmlformats.org/markup-compatibility/2006" xmlns:o="urn:schemas-microsoft-com:office:office" xmlns:r="http://schemas.openxmlformats.org/officeDocument/2006/relationships" xmlns:m="http://schemas.openxmlformats.org/officeDocument/2006/math" xmlns:v="urn:schemas-microsoft-com:vml" xmlns:wp14="http://schemas.microsoft.com/office/word/2010/wordprocessingDrawing" xmlns:wp="http://schemas.openxmlformats.org/drawingml/2006/wordprocessingDrawing" xmlns:w10="urn:schemas-microsoft-com:office:word" xmlns:w="http://schemas.openxmlformats.org/wordprocessingml/2006/main" xmlns:w14="http://schemas.microsoft.com/office/word/2010/wordml" xmlns:w15="http://schemas.microsoft.com/office/word/2012/wordml" xmlns:w16se="http://schemas.microsoft.com/office/word/2015/wordml/symex" xmlns:wpg="http://schemas.microsoft.com/office/word/2010/wordprocessingGroup" xmlns:wpi="http://schemas.microsoft.com/office/word/2010/wordprocessingInk" xmlns:wne="http://schemas.microsoft.com/office/word/2006/wordml" xmlns:wps="http://schemas.microsoft.com/office/word/2010/wordprocessingShape" mc:Ignorable="w14 w15 w16se wp14">
   <w:body>
     <w:p>
       <w:pPr>
@@ -757,6 +757,7 @@
         </w:numPr>
       </w:pPr>
       <w:r>
+        <w:lastRenderedPageBreak/>
         <w:t xml:space="preserve">add </w:t>
       </w:r>
       <w:proofErr w:type="spellStart"/>
@@ -964,18 +965,182 @@
         <w:t xml:space="preserve">add </w:t>
       </w:r>
       <w:proofErr w:type="spellStart"/>
+      <w:proofErr w:type="gramStart"/>
       <w:r>
         <w:t>editPost</w:t>
       </w:r>
       <w:proofErr w:type="spellEnd"/>
       <w:r>
-        <w:t>() in post controller.js</w:t>
-      </w:r>
+        <w:t>(</w:t>
+      </w:r>
+      <w:proofErr w:type="gramEnd"/>
+      <w:r>
+        <w:t>) in post controller.js</w:t>
+      </w:r>
+    </w:p>
+    <w:p>
+      <w:pPr>
+        <w:pStyle w:val="ListParagraph"/>
+        <w:numPr>
+          <w:ilvl w:val="0"/>
+          <w:numId w:val="1"/>
+        </w:numPr>
+      </w:pPr>
+      <w:r>
+        <w:t>wrap username and profile pic in postcard n Link</w:t>
+      </w:r>
+    </w:p>
+    <w:p>
+      <w:pPr>
+        <w:pStyle w:val="ListParagraph"/>
+        <w:numPr>
+          <w:ilvl w:val="0"/>
+          <w:numId w:val="1"/>
+        </w:numPr>
+      </w:pPr>
+      <w:r>
+        <w:t>create profile route in app.js</w:t>
+      </w:r>
+    </w:p>
+    <w:p>
+      <w:pPr>
+        <w:pStyle w:val="ListParagraph"/>
+        <w:numPr>
+          <w:ilvl w:val="0"/>
+          <w:numId w:val="1"/>
+        </w:numPr>
+      </w:pPr>
+      <w:r>
+        <w:t xml:space="preserve">create </w:t>
+      </w:r>
+      <w:proofErr w:type="spellStart"/>
+      <w:r>
+        <w:t>ProfilePage.jsx</w:t>
+      </w:r>
+      <w:proofErr w:type="spellEnd"/>
+    </w:p>
+    <w:p>
+      <w:pPr>
+        <w:pStyle w:val="ListParagraph"/>
+        <w:numPr>
+          <w:ilvl w:val="0"/>
+          <w:numId w:val="1"/>
+        </w:numPr>
+      </w:pPr>
+      <w:r>
+        <w:t xml:space="preserve">send username as argument in the feed component used in </w:t>
+      </w:r>
+      <w:proofErr w:type="spellStart"/>
+      <w:r>
+        <w:t>profilepage</w:t>
+      </w:r>
+      <w:proofErr w:type="spellEnd"/>
+    </w:p>
+    <w:p>
+      <w:pPr>
+        <w:pStyle w:val="ListParagraph"/>
+        <w:numPr>
+          <w:ilvl w:val="0"/>
+          <w:numId w:val="1"/>
+        </w:numPr>
+      </w:pPr>
+      <w:r>
+        <w:t xml:space="preserve">in the feed component use ternary operator to choose between </w:t>
+      </w:r>
+      <w:proofErr w:type="spellStart"/>
+      <w:r>
+        <w:t>getUserPostsCall</w:t>
+      </w:r>
+      <w:proofErr w:type="spellEnd"/>
+      <w:r>
+        <w:t xml:space="preserve"> and </w:t>
+      </w:r>
+      <w:proofErr w:type="spellStart"/>
+      <w:r>
+        <w:t>getAllPostsCall</w:t>
+      </w:r>
+      <w:proofErr w:type="spellEnd"/>
+    </w:p>
+    <w:p>
+      <w:pPr>
+        <w:pStyle w:val="ListParagraph"/>
+        <w:numPr>
+          <w:ilvl w:val="0"/>
+          <w:numId w:val="1"/>
+        </w:numPr>
+      </w:pPr>
+      <w:r>
+        <w:t xml:space="preserve">create </w:t>
+      </w:r>
+      <w:proofErr w:type="spellStart"/>
+      <w:proofErr w:type="gramStart"/>
+      <w:r>
+        <w:t>getUserPostsCall</w:t>
+      </w:r>
+      <w:proofErr w:type="spellEnd"/>
+      <w:r>
+        <w:t>(</w:t>
+      </w:r>
+      <w:proofErr w:type="gramEnd"/>
+      <w:r>
+        <w:t>) in apiCalls.js</w:t>
+      </w:r>
+    </w:p>
+    <w:p>
+      <w:pPr>
+        <w:pStyle w:val="ListParagraph"/>
+        <w:numPr>
+          <w:ilvl w:val="0"/>
+          <w:numId w:val="1"/>
+        </w:numPr>
+      </w:pPr>
+      <w:r>
+        <w:t xml:space="preserve">create </w:t>
+      </w:r>
+      <w:proofErr w:type="spellStart"/>
+      <w:r>
+        <w:t>getUserPosts</w:t>
+      </w:r>
+      <w:proofErr w:type="spellEnd"/>
+      <w:r>
+        <w:t xml:space="preserve"> route in post routes</w:t>
+      </w:r>
+    </w:p>
+    <w:p>
+      <w:pPr>
+        <w:pStyle w:val="ListParagraph"/>
+        <w:numPr>
+          <w:ilvl w:val="0"/>
+          <w:numId w:val="1"/>
+        </w:numPr>
+      </w:pPr>
+      <w:r>
+        <w:t xml:space="preserve">create </w:t>
+      </w:r>
+      <w:proofErr w:type="spellStart"/>
+      <w:proofErr w:type="gramStart"/>
+      <w:r>
+        <w:t>getUserPosts</w:t>
+      </w:r>
+      <w:proofErr w:type="spellEnd"/>
+      <w:r>
+        <w:t>(</w:t>
+      </w:r>
+      <w:proofErr w:type="gramEnd"/>
+      <w:r>
+        <w:t>) in post controller.js</w:t>
+      </w:r>
+    </w:p>
+    <w:p>
+      <w:pPr>
+        <w:pStyle w:val="ListParagraph"/>
+        <w:numPr>
+          <w:ilvl w:val="0"/>
+          <w:numId w:val="1"/>
+        </w:numPr>
+      </w:pPr>
       <w:bookmarkStart w:id="0" w:name="_GoBack"/>
       <w:bookmarkEnd w:id="0"/>
-      <w:r>
-        <w:t xml:space="preserve"> </w:t>
-      </w:r>
     </w:p>
     <w:sectPr>
       <w:pgSz w:w="12240" w:h="15840"/>
@@ -988,7 +1153,7 @@
 </file>
 
 <file path=word/numbering.xml><?xml version="1.0" encoding="utf-8"?>
-<w:numbering xmlns:wpc="http://schemas.microsoft.com/office/word/2010/wordprocessingCanvas" xmlns:cx="http://schemas.microsoft.com/office/drawing/2014/chartex" xmlns:cx1="http://schemas.microsoft.com/office/drawing/2015/9/8/chartex" xmlns:mc="http://schemas.openxmlformats.org/markup-compatibility/2006" xmlns:o="urn:schemas-microsoft-com:office:office" xmlns:r="http://schemas.openxmlformats.org/officeDocument/2006/relationships" xmlns:m="http://schemas.openxmlformats.org/officeDocument/2006/math" xmlns:v="urn:schemas-microsoft-com:vml" xmlns:wp14="http://schemas.microsoft.com/office/word/2010/wordprocessingDrawing" xmlns:wp="http://schemas.openxmlformats.org/drawingml/2006/wordprocessingDrawing" xmlns:w10="urn:schemas-microsoft-com:office:word" xmlns:w="http://schemas.openxmlformats.org/wordprocessingml/2006/main" xmlns:w14="http://schemas.microsoft.com/office/word/2010/wordml" xmlns:w15="http://schemas.microsoft.com/office/word/2012/wordml" xmlns:w16se="http://schemas.microsoft.com/office/word/2015/wordml/symex" xmlns:wpg="http://schemas.microsoft.com/office/word/2010/wordprocessingGroup" xmlns:wpi="http://schemas.microsoft.com/office/word/2010/wordprocessingInk" xmlns:wne="http://schemas.microsoft.com/office/word/2006/wordml" xmlns:wps="http://schemas.microsoft.com/office/word/2010/wordprocessingShape" mc:Ignorable="w14 w15 w16se wp14">
+<w:numbering xmlns:wpc="http://schemas.microsoft.com/office/word/2010/wordprocessingCanvas" xmlns:cx="http://schemas.microsoft.com/office/drawing/2014/chartex" xmlns:mc="http://schemas.openxmlformats.org/markup-compatibility/2006" xmlns:o="urn:schemas-microsoft-com:office:office" xmlns:r="http://schemas.openxmlformats.org/officeDocument/2006/relationships" xmlns:m="http://schemas.openxmlformats.org/officeDocument/2006/math" xmlns:v="urn:schemas-microsoft-com:vml" xmlns:wp14="http://schemas.microsoft.com/office/word/2010/wordprocessingDrawing" xmlns:wp="http://schemas.openxmlformats.org/drawingml/2006/wordprocessingDrawing" xmlns:w10="urn:schemas-microsoft-com:office:word" xmlns:w="http://schemas.openxmlformats.org/wordprocessingml/2006/main" xmlns:w14="http://schemas.microsoft.com/office/word/2010/wordml" xmlns:w15="http://schemas.microsoft.com/office/word/2012/wordml" xmlns:w16se="http://schemas.microsoft.com/office/word/2015/wordml/symex" xmlns:wpg="http://schemas.microsoft.com/office/word/2010/wordprocessingGroup" xmlns:wpi="http://schemas.microsoft.com/office/word/2010/wordprocessingInk" xmlns:wne="http://schemas.microsoft.com/office/word/2006/wordml" xmlns:wps="http://schemas.microsoft.com/office/word/2010/wordprocessingShape" mc:Ignorable="w14 w15 w16se wp14">
   <w:abstractNum w:abstractNumId="0" w15:restartNumberingAfterBreak="0">
     <w:nsid w:val="658B4609"/>
     <w:multiLevelType w:val="hybridMultilevel"/>

</xml_diff>

<commit_message>
feat: Add comments system
</commit_message>
<xml_diff>
--- a/flow.docx
+++ b/flow.docx
@@ -23,12 +23,17 @@
         </w:numPr>
       </w:pPr>
       <w:proofErr w:type="spellStart"/>
+      <w:proofErr w:type="gramStart"/>
       <w:r>
         <w:t>registerUser</w:t>
       </w:r>
       <w:proofErr w:type="spellEnd"/>
       <w:r>
-        <w:t>() in authController</w:t>
+        <w:t>(</w:t>
+      </w:r>
+      <w:proofErr w:type="gramEnd"/>
+      <w:r>
+        <w:t>) in authController</w:t>
       </w:r>
       <w:r>
         <w:t>s</w:t>
@@ -78,10 +83,12 @@
         <w:t xml:space="preserve">insert proxy in frontend </w:t>
       </w:r>
       <w:proofErr w:type="spellStart"/>
+      <w:proofErr w:type="gramStart"/>
       <w:r>
         <w:t>package.json</w:t>
       </w:r>
       <w:proofErr w:type="spellEnd"/>
+      <w:proofErr w:type="gramEnd"/>
     </w:p>
     <w:p>
       <w:pPr>
@@ -131,29 +138,39 @@
         </w:numPr>
       </w:pPr>
       <w:proofErr w:type="spellStart"/>
+      <w:proofErr w:type="gramStart"/>
       <w:r>
         <w:t>registerCall</w:t>
       </w:r>
       <w:proofErr w:type="spellEnd"/>
       <w:r>
-        <w:t>() in apiCalls.js</w:t>
-      </w:r>
-    </w:p>
-    <w:p>
-      <w:pPr>
-        <w:pStyle w:val="ListParagraph"/>
-        <w:numPr>
-          <w:ilvl w:val="0"/>
-          <w:numId w:val="1"/>
-        </w:numPr>
-      </w:pPr>
-      <w:proofErr w:type="spellStart"/>
+        <w:t>(</w:t>
+      </w:r>
+      <w:proofErr w:type="gramEnd"/>
+      <w:r>
+        <w:t>) in apiCalls.js</w:t>
+      </w:r>
+    </w:p>
+    <w:p>
+      <w:pPr>
+        <w:pStyle w:val="ListParagraph"/>
+        <w:numPr>
+          <w:ilvl w:val="0"/>
+          <w:numId w:val="1"/>
+        </w:numPr>
+      </w:pPr>
+      <w:proofErr w:type="spellStart"/>
+      <w:proofErr w:type="gramStart"/>
       <w:r>
         <w:t>loginUser</w:t>
       </w:r>
       <w:proofErr w:type="spellEnd"/>
       <w:r>
-        <w:t>() in authController.js</w:t>
+        <w:t>(</w:t>
+      </w:r>
+      <w:proofErr w:type="gramEnd"/>
+      <w:r>
+        <w:t>) in authController.js</w:t>
       </w:r>
     </w:p>
     <w:p>
@@ -191,12 +208,17 @@
         </w:numPr>
       </w:pPr>
       <w:proofErr w:type="spellStart"/>
+      <w:proofErr w:type="gramStart"/>
       <w:r>
         <w:t>AuthReducer</w:t>
       </w:r>
       <w:proofErr w:type="spellEnd"/>
       <w:r>
-        <w:t>() in authReducer.js</w:t>
+        <w:t>(</w:t>
+      </w:r>
+      <w:proofErr w:type="gramEnd"/>
+      <w:r>
+        <w:t>) in authReducer.js</w:t>
       </w:r>
     </w:p>
     <w:p>
@@ -279,29 +301,39 @@
         </w:numPr>
       </w:pPr>
       <w:proofErr w:type="spellStart"/>
+      <w:proofErr w:type="gramStart"/>
       <w:r>
         <w:t>loginCall</w:t>
       </w:r>
       <w:proofErr w:type="spellEnd"/>
       <w:r>
-        <w:t>() in apiCalls.js</w:t>
-      </w:r>
-    </w:p>
-    <w:p>
-      <w:pPr>
-        <w:pStyle w:val="ListParagraph"/>
-        <w:numPr>
-          <w:ilvl w:val="0"/>
-          <w:numId w:val="1"/>
-        </w:numPr>
-      </w:pPr>
-      <w:proofErr w:type="spellStart"/>
+        <w:t>(</w:t>
+      </w:r>
+      <w:proofErr w:type="gramEnd"/>
+      <w:r>
+        <w:t>) in apiCalls.js</w:t>
+      </w:r>
+    </w:p>
+    <w:p>
+      <w:pPr>
+        <w:pStyle w:val="ListParagraph"/>
+        <w:numPr>
+          <w:ilvl w:val="0"/>
+          <w:numId w:val="1"/>
+        </w:numPr>
+      </w:pPr>
+      <w:proofErr w:type="spellStart"/>
+      <w:proofErr w:type="gramStart"/>
       <w:r>
         <w:t>ProtectedRoute</w:t>
       </w:r>
       <w:proofErr w:type="spellEnd"/>
       <w:r>
-        <w:t xml:space="preserve">() and </w:t>
+        <w:t>(</w:t>
+      </w:r>
+      <w:proofErr w:type="gramEnd"/>
+      <w:r>
+        <w:t xml:space="preserve">) and </w:t>
       </w:r>
       <w:proofErr w:type="spellStart"/>
       <w:r>
@@ -384,12 +416,17 @@
         </w:numPr>
       </w:pPr>
       <w:proofErr w:type="spellStart"/>
+      <w:proofErr w:type="gramStart"/>
       <w:r>
         <w:t>createPost</w:t>
       </w:r>
       <w:proofErr w:type="spellEnd"/>
       <w:r>
-        <w:t>() in postControllers.js</w:t>
+        <w:t>(</w:t>
+      </w:r>
+      <w:proofErr w:type="gramEnd"/>
+      <w:r>
+        <w:t>) in postControllers.js</w:t>
       </w:r>
     </w:p>
     <w:p>
@@ -487,29 +524,39 @@
         <w:t xml:space="preserve">create </w:t>
       </w:r>
       <w:proofErr w:type="spellStart"/>
+      <w:proofErr w:type="gramStart"/>
       <w:r>
         <w:t>PostCard</w:t>
       </w:r>
       <w:proofErr w:type="spellEnd"/>
       <w:r>
-        <w:t>() component</w:t>
-      </w:r>
-    </w:p>
-    <w:p>
-      <w:pPr>
-        <w:pStyle w:val="ListParagraph"/>
-        <w:numPr>
-          <w:ilvl w:val="0"/>
-          <w:numId w:val="1"/>
-        </w:numPr>
-      </w:pPr>
-      <w:proofErr w:type="spellStart"/>
+        <w:t>(</w:t>
+      </w:r>
+      <w:proofErr w:type="gramEnd"/>
+      <w:r>
+        <w:t>) component</w:t>
+      </w:r>
+    </w:p>
+    <w:p>
+      <w:pPr>
+        <w:pStyle w:val="ListParagraph"/>
+        <w:numPr>
+          <w:ilvl w:val="0"/>
+          <w:numId w:val="1"/>
+        </w:numPr>
+      </w:pPr>
+      <w:proofErr w:type="spellStart"/>
+      <w:proofErr w:type="gramStart"/>
       <w:r>
         <w:t>createPostCall</w:t>
       </w:r>
       <w:proofErr w:type="spellEnd"/>
       <w:r>
-        <w:t>() in apiCalls.js</w:t>
+        <w:t>(</w:t>
+      </w:r>
+      <w:proofErr w:type="gramEnd"/>
+      <w:r>
+        <w:t>) in apiCalls.js</w:t>
       </w:r>
     </w:p>
     <w:p>
@@ -549,12 +596,17 @@
         </w:numPr>
       </w:pPr>
       <w:proofErr w:type="spellStart"/>
+      <w:proofErr w:type="gramStart"/>
       <w:r>
         <w:t>getAllPosts</w:t>
       </w:r>
       <w:proofErr w:type="spellEnd"/>
       <w:r>
-        <w:t>() in postController.js</w:t>
+        <w:t>(</w:t>
+      </w:r>
+      <w:proofErr w:type="gramEnd"/>
+      <w:r>
+        <w:t>) in postController.js</w:t>
       </w:r>
     </w:p>
     <w:p>
@@ -583,12 +635,17 @@
         </w:numPr>
       </w:pPr>
       <w:proofErr w:type="spellStart"/>
+      <w:proofErr w:type="gramStart"/>
       <w:r>
         <w:t>getAllPostsCall</w:t>
       </w:r>
       <w:proofErr w:type="spellEnd"/>
       <w:r>
-        <w:t>() in apiCalls.js</w:t>
+        <w:t>(</w:t>
+      </w:r>
+      <w:proofErr w:type="gramEnd"/>
+      <w:r>
+        <w:t>) in apiCalls.js</w:t>
       </w:r>
     </w:p>
     <w:p>
@@ -735,12 +792,17 @@
         <w:t xml:space="preserve">add </w:t>
       </w:r>
       <w:proofErr w:type="spellStart"/>
+      <w:proofErr w:type="gramStart"/>
       <w:r>
         <w:t>likePost</w:t>
       </w:r>
       <w:proofErr w:type="spellEnd"/>
       <w:r>
-        <w:t xml:space="preserve">() in </w:t>
+        <w:t>(</w:t>
+      </w:r>
+      <w:proofErr w:type="gramEnd"/>
+      <w:r>
+        <w:t xml:space="preserve">) in </w:t>
       </w:r>
       <w:proofErr w:type="spellStart"/>
       <w:r>
@@ -811,12 +873,17 @@
         <w:t xml:space="preserve">add </w:t>
       </w:r>
       <w:proofErr w:type="spellStart"/>
+      <w:proofErr w:type="gramStart"/>
       <w:r>
         <w:t>likePostCall</w:t>
       </w:r>
       <w:proofErr w:type="spellEnd"/>
       <w:r>
-        <w:t>() in apiCalls.js</w:t>
+        <w:t>(</w:t>
+      </w:r>
+      <w:proofErr w:type="gramEnd"/>
+      <w:r>
+        <w:t>) in apiCalls.js</w:t>
       </w:r>
     </w:p>
     <w:p>
@@ -831,12 +898,17 @@
         <w:t xml:space="preserve">add </w:t>
       </w:r>
       <w:proofErr w:type="spellStart"/>
+      <w:proofErr w:type="gramStart"/>
       <w:r>
         <w:t>deletePost</w:t>
       </w:r>
       <w:proofErr w:type="spellEnd"/>
       <w:r>
-        <w:t>() in post controller</w:t>
+        <w:t>(</w:t>
+      </w:r>
+      <w:proofErr w:type="gramEnd"/>
+      <w:r>
+        <w:t>) in post controller</w:t>
       </w:r>
     </w:p>
     <w:p>
@@ -888,12 +960,17 @@
         <w:t xml:space="preserve">add </w:t>
       </w:r>
       <w:proofErr w:type="spellStart"/>
+      <w:proofErr w:type="gramStart"/>
       <w:r>
         <w:t>deletePostCall</w:t>
       </w:r>
       <w:proofErr w:type="spellEnd"/>
       <w:r>
-        <w:t>() in apiCalls.js</w:t>
+        <w:t>(</w:t>
+      </w:r>
+      <w:proofErr w:type="gramEnd"/>
+      <w:r>
+        <w:t>) in apiCalls.js</w:t>
       </w:r>
     </w:p>
     <w:p>
@@ -933,12 +1010,17 @@
         <w:t xml:space="preserve">add </w:t>
       </w:r>
       <w:proofErr w:type="spellStart"/>
+      <w:proofErr w:type="gramStart"/>
       <w:r>
         <w:t>handleEditCall</w:t>
       </w:r>
       <w:proofErr w:type="spellEnd"/>
       <w:r>
-        <w:t>() in apiCalls.js</w:t>
+        <w:t>(</w:t>
+      </w:r>
+      <w:proofErr w:type="gramEnd"/>
+      <w:r>
+        <w:t>) in apiCalls.js</w:t>
       </w:r>
     </w:p>
     <w:p>
@@ -1139,6 +1221,176 @@
           <w:numId w:val="1"/>
         </w:numPr>
       </w:pPr>
+      <w:r>
+        <w:t xml:space="preserve">create </w:t>
+      </w:r>
+      <w:proofErr w:type="spellStart"/>
+      <w:r>
+        <w:t>sidebar.jsx</w:t>
+      </w:r>
+      <w:proofErr w:type="spellEnd"/>
+    </w:p>
+    <w:p>
+      <w:pPr>
+        <w:pStyle w:val="ListParagraph"/>
+        <w:numPr>
+          <w:ilvl w:val="0"/>
+          <w:numId w:val="1"/>
+        </w:numPr>
+      </w:pPr>
+      <w:r>
+        <w:t xml:space="preserve">create </w:t>
+      </w:r>
+      <w:proofErr w:type="spellStart"/>
+      <w:r>
+        <w:t>rightbar.jsx</w:t>
+      </w:r>
+      <w:proofErr w:type="spellEnd"/>
+    </w:p>
+    <w:p>
+      <w:pPr>
+        <w:pStyle w:val="ListParagraph"/>
+        <w:numPr>
+          <w:ilvl w:val="0"/>
+          <w:numId w:val="1"/>
+        </w:numPr>
+      </w:pPr>
+      <w:r>
+        <w:t xml:space="preserve">Open </w:t>
+      </w:r>
+      <w:proofErr w:type="spellStart"/>
+      <w:r>
+        <w:t>profile</w:t>
+      </w:r>
+      <w:r>
+        <w:t>Page.jsx</w:t>
+      </w:r>
+      <w:proofErr w:type="spellEnd"/>
+    </w:p>
+    <w:p>
+      <w:pPr>
+        <w:pStyle w:val="ListParagraph"/>
+        <w:numPr>
+          <w:ilvl w:val="0"/>
+          <w:numId w:val="1"/>
+        </w:numPr>
+      </w:pPr>
+      <w:r>
+        <w:t>Fetch profile user</w:t>
+      </w:r>
+      <w:r>
+        <w:t xml:space="preserve"> by </w:t>
+      </w:r>
+      <w:proofErr w:type="spellStart"/>
+      <w:r>
+        <w:t>useEffect</w:t>
+      </w:r>
+      <w:proofErr w:type="spellEnd"/>
+    </w:p>
+    <w:p>
+      <w:pPr>
+        <w:pStyle w:val="ListParagraph"/>
+        <w:numPr>
+          <w:ilvl w:val="0"/>
+          <w:numId w:val="1"/>
+        </w:numPr>
+      </w:pPr>
+      <w:r>
+        <w:t xml:space="preserve">Pass profile user to </w:t>
+      </w:r>
+      <w:proofErr w:type="spellStart"/>
+      <w:r>
+        <w:t>RightBar</w:t>
+      </w:r>
+      <w:proofErr w:type="spellEnd"/>
+    </w:p>
+    <w:p>
+      <w:pPr>
+        <w:pStyle w:val="ListParagraph"/>
+        <w:numPr>
+          <w:ilvl w:val="0"/>
+          <w:numId w:val="1"/>
+        </w:numPr>
+      </w:pPr>
+      <w:r>
+        <w:t>Check if current user follows profile user</w:t>
+      </w:r>
+      <w:r>
+        <w:t xml:space="preserve"> by </w:t>
+      </w:r>
+      <w:proofErr w:type="spellStart"/>
+      <w:r>
+        <w:t>useEffect</w:t>
+      </w:r>
+      <w:proofErr w:type="spellEnd"/>
+    </w:p>
+    <w:p>
+      <w:pPr>
+        <w:pStyle w:val="ListParagraph"/>
+        <w:numPr>
+          <w:ilvl w:val="0"/>
+          <w:numId w:val="1"/>
+        </w:numPr>
+      </w:pPr>
+      <w:r>
+        <w:t>Render Follow/Unfollow button</w:t>
+      </w:r>
+    </w:p>
+    <w:p>
+      <w:pPr>
+        <w:pStyle w:val="ListParagraph"/>
+        <w:numPr>
+          <w:ilvl w:val="0"/>
+          <w:numId w:val="1"/>
+        </w:numPr>
+      </w:pPr>
+      <w:r>
+        <w:t>Click button</w:t>
+      </w:r>
+    </w:p>
+    <w:p>
+      <w:pPr>
+        <w:pStyle w:val="ListParagraph"/>
+        <w:numPr>
+          <w:ilvl w:val="0"/>
+          <w:numId w:val="1"/>
+        </w:numPr>
+      </w:pPr>
+      <w:r>
+        <w:t xml:space="preserve">Send both user IDs to follow/unfollow </w:t>
+      </w:r>
+      <w:proofErr w:type="spellStart"/>
+      <w:r>
+        <w:t>apiCalls</w:t>
+      </w:r>
+      <w:proofErr w:type="spellEnd"/>
+    </w:p>
+    <w:p>
+      <w:pPr>
+        <w:pStyle w:val="ListParagraph"/>
+        <w:numPr>
+          <w:ilvl w:val="0"/>
+          <w:numId w:val="1"/>
+        </w:numPr>
+      </w:pPr>
+      <w:r>
+        <w:t>Dispatch context update</w:t>
+      </w:r>
+    </w:p>
+    <w:p>
+      <w:pPr>
+        <w:pStyle w:val="ListParagraph"/>
+        <w:numPr>
+          <w:ilvl w:val="0"/>
+          <w:numId w:val="1"/>
+        </w:numPr>
+      </w:pPr>
+      <w:r>
+        <w:t>Update followers/following arrays</w:t>
+      </w:r>
+      <w:r>
+        <w:t xml:space="preserve"> un follow/unfollow user controllers</w:t>
+      </w:r>
       <w:bookmarkStart w:id="0" w:name="_GoBack"/>
       <w:bookmarkEnd w:id="0"/>
     </w:p>

</xml_diff>

<commit_message>
feat: add backend validation for comment
</commit_message>
<xml_diff>
--- a/flow.docx
+++ b/flow.docx
@@ -1390,6 +1390,93 @@
       </w:r>
       <w:r>
         <w:t xml:space="preserve"> un follow/unfollow user controllers</w:t>
+      </w:r>
+    </w:p>
+    <w:p>
+      <w:pPr>
+        <w:pStyle w:val="ListParagraph"/>
+        <w:numPr>
+          <w:ilvl w:val="0"/>
+          <w:numId w:val="1"/>
+        </w:numPr>
+      </w:pPr>
+      <w:r>
+        <w:t>Add comments field in the post model</w:t>
+      </w:r>
+    </w:p>
+    <w:p>
+      <w:pPr>
+        <w:pStyle w:val="ListParagraph"/>
+        <w:numPr>
+          <w:ilvl w:val="0"/>
+          <w:numId w:val="1"/>
+        </w:numPr>
+      </w:pPr>
+      <w:r>
+        <w:t>Type comment</w:t>
+      </w:r>
+      <w:r>
+        <w:t xml:space="preserve"> in the box created in postcard</w:t>
+      </w:r>
+    </w:p>
+    <w:p>
+      <w:pPr>
+        <w:pStyle w:val="ListParagraph"/>
+        <w:numPr>
+          <w:ilvl w:val="0"/>
+          <w:numId w:val="1"/>
+        </w:numPr>
+      </w:pPr>
+      <w:r>
+        <w:t>Click Comment</w:t>
+      </w:r>
+    </w:p>
+    <w:p>
+      <w:pPr>
+        <w:pStyle w:val="ListParagraph"/>
+        <w:numPr>
+          <w:ilvl w:val="0"/>
+          <w:numId w:val="1"/>
+        </w:numPr>
+      </w:pPr>
+      <w:r>
+        <w:t>Backend pushes comment into post</w:t>
+      </w:r>
+    </w:p>
+    <w:p>
+      <w:pPr>
+        <w:pStyle w:val="ListParagraph"/>
+        <w:numPr>
+          <w:ilvl w:val="0"/>
+          <w:numId w:val="1"/>
+        </w:numPr>
+      </w:pPr>
+      <w:r>
+        <w:t>Updated post returns</w:t>
+      </w:r>
+    </w:p>
+    <w:p>
+      <w:pPr>
+        <w:pStyle w:val="ListParagraph"/>
+        <w:numPr>
+          <w:ilvl w:val="0"/>
+          <w:numId w:val="1"/>
+        </w:numPr>
+      </w:pPr>
+      <w:r>
+        <w:t>Replace only that post in Feed state</w:t>
+      </w:r>
+    </w:p>
+    <w:p>
+      <w:pPr>
+        <w:pStyle w:val="ListParagraph"/>
+        <w:numPr>
+          <w:ilvl w:val="0"/>
+          <w:numId w:val="1"/>
+        </w:numPr>
+      </w:pPr>
+      <w:r>
+        <w:t>Comment appears instantly</w:t>
       </w:r>
       <w:bookmarkStart w:id="0" w:name="_GoBack"/>
       <w:bookmarkEnd w:id="0"/>

</xml_diff>